<commit_message>
IBE: start day, per-day hour overrides, work hours window, OT calculation
- Config panel gains "Start Day" dropdown (Mon–Sun) to offset the first
  inspection week; subsequent weeks use the full set of work days
- Schedule table gains an editable "Hrs" column so each inspection day
  can have its own hour count, independent of the global Hours/Day default
- Work Hours fields (24h start / end, default 8–17) define the normal
  work window; anything outside counts as weekday OT
- Cost calculation now splits labor into three buckets:
    regular (within window) × rate
    OT      (weekday excess) × rate × 1.5
    weekend (Sat/Sun days)   × rate × 2.0
- Formula labels appear under each cost cell in the summary card,
  showing the calculation that produced each figure (e.g. "72.0h × $125")
- OT breakdown is shown in the Labor formula when OT or weekend hours exist
- start_day / work_start / work_end persisted in .mcmxi save files

Co-Authored-By: Claude Sonnet 4.6 <noreply@anthropic.com>
</commit_message>
<xml_diff>
--- a/thermal_template.docx
+++ b/thermal_template.docx
@@ -351,7 +351,6 @@
                                 <w:szCs w:val="32"/>
                               </w:rPr>
                             </w:pPr>
-                            <w:proofErr w:type="gramStart"/>
                             <w:r>
                               <w:rPr>
                                 <w:rFonts w:ascii="Aptos" w:eastAsia="Aptos" w:hAnsi="Aptos" w:cs="Aptos"/>
@@ -361,67 +360,7 @@
                                 <w:sz w:val="32"/>
                                 <w:szCs w:val="32"/>
                               </w:rPr>
-                              <w:t xml:space="preserve">{{ </w:t>
-                            </w:r>
-                            <w:proofErr w:type="spellStart"/>
-                            <w:r>
-                              <w:rPr>
-                                <w:rFonts w:ascii="Aptos" w:eastAsia="Aptos" w:hAnsi="Aptos" w:cs="Aptos"/>
-                                <w:b/>
-                                <w:bCs/>
-                                <w:color w:val="9E1B32"/>
-                                <w:sz w:val="32"/>
-                                <w:szCs w:val="32"/>
-                              </w:rPr>
-                              <w:t>customer</w:t>
-                            </w:r>
-                            <w:proofErr w:type="gramEnd"/>
-                            <w:r>
-                              <w:rPr>
-                                <w:rFonts w:ascii="Aptos" w:eastAsia="Aptos" w:hAnsi="Aptos" w:cs="Aptos"/>
-                                <w:b/>
-                                <w:bCs/>
-                                <w:color w:val="9E1B32"/>
-                                <w:sz w:val="32"/>
-                                <w:szCs w:val="32"/>
-                              </w:rPr>
-                              <w:t>_</w:t>
-                            </w:r>
-                            <w:proofErr w:type="gramStart"/>
-                            <w:r>
-                              <w:rPr>
-                                <w:rFonts w:ascii="Aptos" w:eastAsia="Aptos" w:hAnsi="Aptos" w:cs="Aptos"/>
-                                <w:b/>
-                                <w:bCs/>
-                                <w:color w:val="9E1B32"/>
-                                <w:sz w:val="32"/>
-                                <w:szCs w:val="32"/>
-                              </w:rPr>
-                              <w:t>picture</w:t>
-                            </w:r>
-                            <w:proofErr w:type="spellEnd"/>
-                            <w:r>
-                              <w:rPr>
-                                <w:rFonts w:ascii="Aptos" w:eastAsia="Aptos" w:hAnsi="Aptos" w:cs="Aptos"/>
-                                <w:b/>
-                                <w:bCs/>
-                                <w:color w:val="9E1B32"/>
-                                <w:sz w:val="32"/>
-                                <w:szCs w:val="32"/>
-                              </w:rPr>
-                              <w:t xml:space="preserve"> }</w:t>
-                            </w:r>
-                            <w:proofErr w:type="gramEnd"/>
-                            <w:r>
-                              <w:rPr>
-                                <w:rFonts w:ascii="Aptos" w:eastAsia="Aptos" w:hAnsi="Aptos" w:cs="Aptos"/>
-                                <w:b/>
-                                <w:bCs/>
-                                <w:color w:val="9E1B32"/>
-                                <w:sz w:val="32"/>
-                                <w:szCs w:val="32"/>
-                              </w:rPr>
-                              <w:t>}</w:t>
+                              <w:t>{{ customer_picture }}</w:t>
                             </w:r>
                           </w:p>
                         </w:txbxContent>
@@ -919,23 +858,13 @@
                               </w:rPr>
                               <w:t>{{</w:t>
                             </w:r>
-                            <w:proofErr w:type="spellStart"/>
                             <w:r>
                               <w:rPr>
                                 <w:rFonts w:ascii="Aptos Narrow" w:hAnsi="Aptos Narrow"/>
                                 <w:i/>
                                 <w:iCs/>
                               </w:rPr>
-                              <w:t>today_date</w:t>
-                            </w:r>
-                            <w:proofErr w:type="spellEnd"/>
-                            <w:r>
-                              <w:rPr>
-                                <w:rFonts w:ascii="Aptos Narrow" w:hAnsi="Aptos Narrow"/>
-                                <w:i/>
-                                <w:iCs/>
-                              </w:rPr>
-                              <w:t>}}</w:t>
+                              <w:t>today_date}}</w:t>
                             </w:r>
                           </w:p>
                         </w:txbxContent>
@@ -1446,7 +1375,6 @@
                               </w:rPr>
                               <w:t>{{</w:t>
                             </w:r>
-                            <w:proofErr w:type="spellStart"/>
                             <w:r>
                               <w:rPr>
                                 <w:rFonts w:ascii="Aptos Narrow" w:hAnsi="Aptos Narrow"/>
@@ -1454,17 +1382,7 @@
                                 <w:sz w:val="36"/>
                                 <w:szCs w:val="36"/>
                               </w:rPr>
-                              <w:t>project_name</w:t>
-                            </w:r>
-                            <w:proofErr w:type="spellEnd"/>
-                            <w:r>
-                              <w:rPr>
-                                <w:rFonts w:ascii="Aptos Narrow" w:hAnsi="Aptos Narrow"/>
-                                <w:color w:val="000000" w:themeColor="text1"/>
-                                <w:sz w:val="36"/>
-                                <w:szCs w:val="36"/>
-                              </w:rPr>
-                              <w:t>}}</w:t>
+                              <w:t>project_name}}</w:t>
                             </w:r>
                           </w:p>
                           <w:bookmarkEnd w:id="0"/>
@@ -1481,23 +1399,7 @@
                                 <w:rFonts w:ascii="Aptos Narrow" w:hAnsi="Aptos Narrow"/>
                                 <w:color w:val="000000" w:themeColor="text1"/>
                               </w:rPr>
-                              <w:t>{{</w:t>
-                            </w:r>
-                            <w:proofErr w:type="spellStart"/>
-                            <w:r>
-                              <w:rPr>
-                                <w:rFonts w:ascii="Aptos Narrow" w:hAnsi="Aptos Narrow"/>
-                                <w:color w:val="000000" w:themeColor="text1"/>
-                              </w:rPr>
-                              <w:t>customer_name</w:t>
-                            </w:r>
-                            <w:proofErr w:type="spellEnd"/>
-                            <w:r>
-                              <w:rPr>
-                                <w:rFonts w:ascii="Aptos Narrow" w:hAnsi="Aptos Narrow"/>
-                                <w:color w:val="000000" w:themeColor="text1"/>
-                              </w:rPr>
-                              <w:t>}}</w:t>
+                              <w:t>{{customer_name}}</w:t>
                             </w:r>
                             <w:r>
                               <w:rPr>
@@ -1511,23 +1413,7 @@
                                 <w:rFonts w:ascii="Aptos Narrow" w:hAnsi="Aptos Narrow"/>
                                 <w:color w:val="000000" w:themeColor="text1"/>
                               </w:rPr>
-                              <w:t>{{</w:t>
-                            </w:r>
-                            <w:proofErr w:type="spellStart"/>
-                            <w:r>
-                              <w:rPr>
-                                <w:rFonts w:ascii="Aptos Narrow" w:hAnsi="Aptos Narrow"/>
-                                <w:color w:val="000000" w:themeColor="text1"/>
-                              </w:rPr>
-                              <w:t>customer_location</w:t>
-                            </w:r>
-                            <w:proofErr w:type="spellEnd"/>
-                            <w:r>
-                              <w:rPr>
-                                <w:rFonts w:ascii="Aptos Narrow" w:hAnsi="Aptos Narrow"/>
-                                <w:color w:val="000000" w:themeColor="text1"/>
-                              </w:rPr>
-                              <w:t>}}</w:t>
+                              <w:t>{{customer_location}}</w:t>
                             </w:r>
                           </w:p>
                         </w:txbxContent>
@@ -1727,21 +1613,12 @@
                               </w:rPr>
                               <w:t>{{</w:t>
                             </w:r>
-                            <w:proofErr w:type="spellStart"/>
                             <w:r>
                               <w:rPr>
                                 <w:rFonts w:ascii="Aptos Narrow" w:hAnsi="Aptos Narrow"/>
                                 <w:color w:val="FFFFFF" w:themeColor="background1"/>
                               </w:rPr>
-                              <w:t>proposal_number</w:t>
-                            </w:r>
-                            <w:proofErr w:type="spellEnd"/>
-                            <w:r>
-                              <w:rPr>
-                                <w:rFonts w:ascii="Aptos Narrow" w:hAnsi="Aptos Narrow"/>
-                                <w:color w:val="FFFFFF" w:themeColor="background1"/>
-                              </w:rPr>
-                              <w:t>}}</w:t>
+                              <w:t>proposal_number}}</w:t>
                             </w:r>
                           </w:p>
                           <w:p>
@@ -1794,23 +1671,7 @@
                                 <w:rFonts w:ascii="Aptos Narrow" w:hAnsi="Aptos Narrow"/>
                                 <w:color w:val="FFFFFF" w:themeColor="background1"/>
                               </w:rPr>
-                              <w:t>{{</w:t>
-                            </w:r>
-                            <w:proofErr w:type="spellStart"/>
-                            <w:r>
-                              <w:rPr>
-                                <w:rFonts w:ascii="Aptos Narrow" w:hAnsi="Aptos Narrow"/>
-                                <w:color w:val="FFFFFF" w:themeColor="background1"/>
-                              </w:rPr>
-                              <w:t>pres_name</w:t>
-                            </w:r>
-                            <w:proofErr w:type="spellEnd"/>
-                            <w:r>
-                              <w:rPr>
-                                <w:rFonts w:ascii="Aptos Narrow" w:hAnsi="Aptos Narrow"/>
-                                <w:color w:val="FFFFFF" w:themeColor="background1"/>
-                              </w:rPr>
-                              <w:t>}}</w:t>
+                              <w:t>{{pres_name}}</w:t>
                             </w:r>
                             <w:r>
                               <w:rPr>
@@ -1826,23 +1687,7 @@
                                 <w:color w:val="FFFFFF" w:themeColor="background1"/>
                               </w:rPr>
                               <w:br/>
-                              <w:t>{{</w:t>
-                            </w:r>
-                            <w:proofErr w:type="spellStart"/>
-                            <w:r>
-                              <w:rPr>
-                                <w:rFonts w:ascii="Aptos Narrow" w:hAnsi="Aptos Narrow"/>
-                                <w:color w:val="FFFFFF" w:themeColor="background1"/>
-                              </w:rPr>
-                              <w:t>pres_email</w:t>
-                            </w:r>
-                            <w:proofErr w:type="spellEnd"/>
-                            <w:r>
-                              <w:rPr>
-                                <w:rFonts w:ascii="Aptos Narrow" w:hAnsi="Aptos Narrow"/>
-                                <w:color w:val="FFFFFF" w:themeColor="background1"/>
-                              </w:rPr>
-                              <w:t>}}</w:t>
+                              <w:t>{{pres_email}}</w:t>
                             </w:r>
                           </w:p>
                           <w:p>
@@ -1859,23 +1704,7 @@
                                 <w:color w:val="FFFFFF" w:themeColor="background1"/>
                               </w:rPr>
                               <w:br/>
-                              <w:t>{{</w:t>
-                            </w:r>
-                            <w:proofErr w:type="spellStart"/>
-                            <w:r>
-                              <w:rPr>
-                                <w:rFonts w:ascii="Aptos Narrow" w:hAnsi="Aptos Narrow"/>
-                                <w:color w:val="FFFFFF" w:themeColor="background1"/>
-                              </w:rPr>
-                              <w:t>acct_name</w:t>
-                            </w:r>
-                            <w:proofErr w:type="spellEnd"/>
-                            <w:r>
-                              <w:rPr>
-                                <w:rFonts w:ascii="Aptos Narrow" w:hAnsi="Aptos Narrow"/>
-                                <w:color w:val="FFFFFF" w:themeColor="background1"/>
-                              </w:rPr>
-                              <w:t>}}</w:t>
+                              <w:t>{{acct_name}}</w:t>
                             </w:r>
                             <w:r>
                               <w:rPr>
@@ -1891,23 +1720,7 @@
                                 <w:color w:val="FFFFFF" w:themeColor="background1"/>
                               </w:rPr>
                               <w:br/>
-                              <w:t>{{</w:t>
-                            </w:r>
-                            <w:proofErr w:type="spellStart"/>
-                            <w:r>
-                              <w:rPr>
-                                <w:rFonts w:ascii="Aptos Narrow" w:hAnsi="Aptos Narrow"/>
-                                <w:color w:val="FFFFFF" w:themeColor="background1"/>
-                              </w:rPr>
-                              <w:t>acct_email</w:t>
-                            </w:r>
-                            <w:proofErr w:type="spellEnd"/>
-                            <w:r>
-                              <w:rPr>
-                                <w:rFonts w:ascii="Aptos Narrow" w:hAnsi="Aptos Narrow"/>
-                                <w:color w:val="FFFFFF" w:themeColor="background1"/>
-                              </w:rPr>
-                              <w:t>}}</w:t>
+                              <w:t>{{acct_email}}</w:t>
                             </w:r>
                           </w:p>
                         </w:txbxContent>
@@ -4199,16 +4012,12 @@
         </w:numPr>
         <w:rPr>
           <w:rFonts w:ascii="Aptos" w:hAnsi="Aptos"/>
-          <w:b/>
-          <w:bCs/>
           <w:color w:val="1A1A2E"/>
         </w:rPr>
       </w:pPr>
       <w:r>
         <w:rPr>
           <w:rFonts w:ascii="Aptos" w:hAnsi="Aptos"/>
-          <w:b/>
-          <w:bCs/>
           <w:color w:val="1A1A2E"/>
         </w:rPr>
         <w:t xml:space="preserve">Shall provide one qualified </w:t>
@@ -4217,8 +4026,6 @@
       <w:r>
         <w:rPr>
           <w:rFonts w:ascii="Aptos" w:hAnsi="Aptos"/>
-          <w:b/>
-          <w:bCs/>
           <w:color w:val="1A1A2E"/>
         </w:rPr>
         <w:t>persons</w:t>
@@ -4227,8 +4034,6 @@
       <w:r>
         <w:rPr>
           <w:rFonts w:ascii="Aptos" w:hAnsi="Aptos"/>
-          <w:b/>
-          <w:bCs/>
           <w:color w:val="1A1A2E"/>
         </w:rPr>
         <w:t xml:space="preserve"> who are familiar with the plant to locate and identify all applicable machinery and equipment. These </w:t>
@@ -4237,8 +4042,6 @@
       <w:r>
         <w:rPr>
           <w:rFonts w:ascii="Aptos" w:hAnsi="Aptos"/>
-          <w:b/>
-          <w:bCs/>
           <w:color w:val="1A1A2E"/>
         </w:rPr>
         <w:t>persons</w:t>
@@ -4247,8 +4050,6 @@
       <w:r>
         <w:rPr>
           <w:rFonts w:ascii="Aptos" w:hAnsi="Aptos"/>
-          <w:b/>
-          <w:bCs/>
           <w:color w:val="1A1A2E"/>
         </w:rPr>
         <w:t xml:space="preserve"> should </w:t>
@@ -4257,8 +4058,6 @@
       <w:r>
         <w:rPr>
           <w:rFonts w:ascii="Aptos" w:hAnsi="Aptos"/>
-          <w:b/>
-          <w:bCs/>
           <w:color w:val="1A1A2E"/>
         </w:rPr>
         <w:t>be available at all times</w:t>
@@ -4267,8 +4066,6 @@
       <w:r>
         <w:rPr>
           <w:rFonts w:ascii="Aptos" w:hAnsi="Aptos"/>
-          <w:b/>
-          <w:bCs/>
           <w:color w:val="1A1A2E"/>
         </w:rPr>
         <w:t xml:space="preserve"> during the data collection process.</w:t>
@@ -4658,7 +4455,7 @@
                 <w:rFonts w:ascii="Aptos" w:hAnsi="Aptos"/>
                 <w:b/>
               </w:rPr>
-              <w:t>Thermal Imaging Report</w:t>
+              <w:t>MCMX-IRSCAN-REPORT</w:t>
             </w:r>
           </w:p>
         </w:tc>
@@ -13183,37 +12980,6 @@
 </file>
 
 <file path=customXml/item1.xml><?xml version="1.0" encoding="utf-8"?>
-<b:Sources xmlns:b="http://schemas.openxmlformats.org/officeDocument/2006/bibliography" xmlns="http://schemas.openxmlformats.org/officeDocument/2006/bibliography" SelectedStyle="\APASixthEditionOfficeOnline.xsl" StyleName="APA" Version="6"/>
-</file>
-
-<file path=customXml/item2.xml><?xml version="1.0" encoding="utf-8"?>
-<?mso-contentType ?>
-<FormTemplates xmlns="http://schemas.microsoft.com/sharepoint/v3/contenttype/forms">
-  <Display>DocumentLibraryForm</Display>
-  <Edit>DocumentLibraryForm</Edit>
-  <New>DocumentLibraryForm</New>
-</FormTemplates>
-</file>
-
-<file path=customXml/item3.xml><?xml version="1.0" encoding="utf-8"?>
-<p:properties xmlns:p="http://schemas.microsoft.com/office/2006/metadata/properties" xmlns:xsi="http://www.w3.org/2001/XMLSchema-instance" xmlns:pc="http://schemas.microsoft.com/office/infopath/2007/PartnerControls">
-  <documentManagement>
-    <TaxCatchAll xmlns="1240a608-ab0c-4b9e-a7e8-98b322547dfc" xsi:nil="true"/>
-    <lcf76f155ced4ddcb4097134ff3c332f xmlns="17280a2b-37da-44d9-bded-03910e228e5a">
-      <Terms xmlns="http://schemas.microsoft.com/office/infopath/2007/PartnerControls"/>
-    </lcf76f155ced4ddcb4097134ff3c332f>
-    <LastEdited xmlns="17280a2b-37da-44d9-bded-03910e228e5a">
-      <UserInfo>
-        <DisplayName/>
-        <AccountId xsi:nil="true"/>
-        <AccountType/>
-      </UserInfo>
-    </LastEdited>
-  </documentManagement>
-</p:properties>
-</file>
-
-<file path=customXml/item4.xml><?xml version="1.0" encoding="utf-8"?>
 <ct:contentTypeSchema xmlns:ct="http://schemas.microsoft.com/office/2006/metadata/contentType" xmlns:ma="http://schemas.microsoft.com/office/2006/metadata/properties/metaAttributes" ct:_="" ma:_="" ma:contentTypeName="Document" ma:contentTypeID="0x01010091DC0C81704971498909B37128C6313A" ma:contentTypeVersion="20" ma:contentTypeDescription="Create a new document." ma:contentTypeScope="" ma:versionID="e565a2cacd807b31cd07b8d522cae671">
   <xsd:schema xmlns:xsd="http://www.w3.org/2001/XMLSchema" xmlns:xs="http://www.w3.org/2001/XMLSchema" xmlns:p="http://schemas.microsoft.com/office/2006/metadata/properties" xmlns:ns2="17280a2b-37da-44d9-bded-03910e228e5a" xmlns:ns3="1240a608-ab0c-4b9e-a7e8-98b322547dfc" targetNamespace="http://schemas.microsoft.com/office/2006/metadata/properties" ma:root="true" ma:fieldsID="0110d707138436e12cbb4669245872c4" ns2:_="" ns3:_="">
     <xsd:import namespace="17280a2b-37da-44d9-bded-03910e228e5a"/>
@@ -13494,34 +13260,38 @@
 </ct:contentTypeSchema>
 </file>
 
-<file path=customXml/itemProps1.xml><?xml version="1.0" encoding="utf-8"?>
-<ds:datastoreItem xmlns:ds="http://schemas.openxmlformats.org/officeDocument/2006/customXml" ds:itemID="{019E14DF-1C9B-43A7-814A-E736EE78D25A}">
-  <ds:schemaRefs>
-    <ds:schemaRef ds:uri="http://schemas.openxmlformats.org/officeDocument/2006/bibliography"/>
-  </ds:schemaRefs>
-</ds:datastoreItem>
+<file path=customXml/item2.xml><?xml version="1.0" encoding="utf-8"?>
+<p:properties xmlns:p="http://schemas.microsoft.com/office/2006/metadata/properties" xmlns:xsi="http://www.w3.org/2001/XMLSchema-instance" xmlns:pc="http://schemas.microsoft.com/office/infopath/2007/PartnerControls">
+  <documentManagement>
+    <TaxCatchAll xmlns="1240a608-ab0c-4b9e-a7e8-98b322547dfc" xsi:nil="true"/>
+    <lcf76f155ced4ddcb4097134ff3c332f xmlns="17280a2b-37da-44d9-bded-03910e228e5a">
+      <Terms xmlns="http://schemas.microsoft.com/office/infopath/2007/PartnerControls"/>
+    </lcf76f155ced4ddcb4097134ff3c332f>
+    <LastEdited xmlns="17280a2b-37da-44d9-bded-03910e228e5a">
+      <UserInfo>
+        <DisplayName/>
+        <AccountId xsi:nil="true"/>
+        <AccountType/>
+      </UserInfo>
+    </LastEdited>
+  </documentManagement>
+</p:properties>
 </file>
 
-<file path=customXml/itemProps2.xml><?xml version="1.0" encoding="utf-8"?>
-<ds:datastoreItem xmlns:ds="http://schemas.openxmlformats.org/officeDocument/2006/customXml" ds:itemID="{5B4036AD-D8C8-419D-BFFE-96A2DC0D267F}">
-  <ds:schemaRefs>
-    <ds:schemaRef ds:uri="http://schemas.microsoft.com/sharepoint/v3/contenttype/forms"/>
-  </ds:schemaRefs>
-</ds:datastoreItem>
+<file path=customXml/item3.xml><?xml version="1.0" encoding="utf-8"?>
+<?mso-contentType ?>
+<FormTemplates xmlns="http://schemas.microsoft.com/sharepoint/v3/contenttype/forms">
+  <Display>DocumentLibraryForm</Display>
+  <Edit>DocumentLibraryForm</Edit>
+  <New>DocumentLibraryForm</New>
+</FormTemplates>
 </file>
 
-<file path=customXml/itemProps3.xml><?xml version="1.0" encoding="utf-8"?>
-<ds:datastoreItem xmlns:ds="http://schemas.openxmlformats.org/officeDocument/2006/customXml" ds:itemID="{198F2852-3330-4053-9879-43F29ED4AB86}">
-  <ds:schemaRefs>
-    <ds:schemaRef ds:uri="http://schemas.microsoft.com/office/2006/metadata/properties"/>
-    <ds:schemaRef ds:uri="http://schemas.microsoft.com/office/infopath/2007/PartnerControls"/>
-    <ds:schemaRef ds:uri="1240a608-ab0c-4b9e-a7e8-98b322547dfc"/>
-    <ds:schemaRef ds:uri="17280a2b-37da-44d9-bded-03910e228e5a"/>
-  </ds:schemaRefs>
-</ds:datastoreItem>
+<file path=customXml/item4.xml><?xml version="1.0" encoding="utf-8"?>
+<b:Sources xmlns:b="http://schemas.openxmlformats.org/officeDocument/2006/bibliography" xmlns="http://schemas.openxmlformats.org/officeDocument/2006/bibliography" SelectedStyle="\APASixthEditionOfficeOnline.xsl" StyleName="APA" Version="6"/>
 </file>
 
-<file path=customXml/itemProps4.xml><?xml version="1.0" encoding="utf-8"?>
+<file path=customXml/itemProps1.xml><?xml version="1.0" encoding="utf-8"?>
 <ds:datastoreItem xmlns:ds="http://schemas.openxmlformats.org/officeDocument/2006/customXml" ds:itemID="{3ACD135F-19EF-4809-846A-B652A325CBFC}">
   <ds:schemaRefs>
     <ds:schemaRef ds:uri="http://schemas.microsoft.com/office/2006/metadata/contentType"/>
@@ -13540,6 +13310,33 @@
 </ds:datastoreItem>
 </file>
 
+<file path=customXml/itemProps2.xml><?xml version="1.0" encoding="utf-8"?>
+<ds:datastoreItem xmlns:ds="http://schemas.openxmlformats.org/officeDocument/2006/customXml" ds:itemID="{198F2852-3330-4053-9879-43F29ED4AB86}">
+  <ds:schemaRefs>
+    <ds:schemaRef ds:uri="http://schemas.microsoft.com/office/2006/metadata/properties"/>
+    <ds:schemaRef ds:uri="http://schemas.microsoft.com/office/infopath/2007/PartnerControls"/>
+    <ds:schemaRef ds:uri="1240a608-ab0c-4b9e-a7e8-98b322547dfc"/>
+    <ds:schemaRef ds:uri="17280a2b-37da-44d9-bded-03910e228e5a"/>
+  </ds:schemaRefs>
+</ds:datastoreItem>
+</file>
+
+<file path=customXml/itemProps3.xml><?xml version="1.0" encoding="utf-8"?>
+<ds:datastoreItem xmlns:ds="http://schemas.openxmlformats.org/officeDocument/2006/customXml" ds:itemID="{5B4036AD-D8C8-419D-BFFE-96A2DC0D267F}">
+  <ds:schemaRefs>
+    <ds:schemaRef ds:uri="http://schemas.microsoft.com/sharepoint/v3/contenttype/forms"/>
+  </ds:schemaRefs>
+</ds:datastoreItem>
+</file>
+
+<file path=customXml/itemProps4.xml><?xml version="1.0" encoding="utf-8"?>
+<ds:datastoreItem xmlns:ds="http://schemas.openxmlformats.org/officeDocument/2006/customXml" ds:itemID="{019E14DF-1C9B-43A7-814A-E736EE78D25A}">
+  <ds:schemaRefs>
+    <ds:schemaRef ds:uri="http://schemas.openxmlformats.org/officeDocument/2006/bibliography"/>
+  </ds:schemaRefs>
+</ds:datastoreItem>
+</file>
+
 <file path=docMetadata/LabelInfo.xml><?xml version="1.0" encoding="utf-8"?>
 <clbl:labelList xmlns:clbl="http://schemas.microsoft.com/office/2020/mipLabelMetadata">
   <clbl:label id="{c5d04ce6-c381-45a5-bb15-1f1d4a5e6746}" enabled="0" method="" siteId="{c5d04ce6-c381-45a5-bb15-1f1d4a5e6746}" removed="1"/>

</xml_diff>